<commit_message>
tool controll panel introduce"
</commit_message>
<xml_diff>
--- a/outputs/reports/Multi-Agent System Analysis Report.docx
+++ b/outputs/reports/Multi-Agent System Analysis Report.docx
@@ -16,12 +16,12 @@
     </w:p>
     <w:p>
       <w:r>
-        <w:t>The final answer is:</w:t>
+        <w:t>**FINAL ANSWER**</w:t>
       </w:r>
     </w:p>
     <w:p>
       <w:r>
-        <w:t>**The top 10 best songs of Michael Jackson are:**</w:t>
+        <w:t>To address the identified security risks introduced by AI systems, organizations should implement the following practical mitigation strategies:</w:t>
       </w:r>
     </w:p>
     <w:p>
@@ -29,7 +29,7 @@
         <w:pStyle w:val="ListNumber"/>
       </w:pPr>
       <w:r>
-        <w:t>**Billie Jean** (1983)</w:t>
+        <w:t>Implement robust testing and validation procedures to ensure AI models and digital twins are secure and functioning as intended.</w:t>
       </w:r>
     </w:p>
     <w:p>
@@ -37,7 +37,7 @@
         <w:pStyle w:val="ListNumber"/>
       </w:pPr>
       <w:r>
-        <w:t>**Thriller** (1982)</w:t>
+        <w:t>Use secure AI development practices, including secure coding techniques and secure data storage and transmission protocols.</w:t>
       </w:r>
     </w:p>
     <w:p>
@@ -45,7 +45,7 @@
         <w:pStyle w:val="ListNumber"/>
       </w:pPr>
       <w:r>
-        <w:t>**Beat It** (1982)</w:t>
+        <w:t>Establish AI-specific security protocols and policies to address the unique security challenges associated with AI.</w:t>
       </w:r>
     </w:p>
     <w:p>
@@ -53,7 +53,7 @@
         <w:pStyle w:val="ListNumber"/>
       </w:pPr>
       <w:r>
-        <w:t>**Bad** (1987)</w:t>
+        <w:t>Implement blockchain technology to enhance data privacy and protection.</w:t>
       </w:r>
     </w:p>
     <w:p>
@@ -61,7 +61,7 @@
         <w:pStyle w:val="ListNumber"/>
       </w:pPr>
       <w:r>
-        <w:t>**Black or White** (1991)</w:t>
+        <w:t>Use secure IoMT communication protocols and decentralised systems to enhance device authentication and data integrity.</w:t>
       </w:r>
     </w:p>
     <w:p>
@@ -69,7 +69,7 @@
         <w:pStyle w:val="ListNumber"/>
       </w:pPr>
       <w:r>
-        <w:t>**The Way You Make Me Feel** (1987)</w:t>
+        <w:t>Implement federated learning to reduce risks of adversarial and poisoning attacks.</w:t>
       </w:r>
     </w:p>
     <w:p>
@@ -77,7 +77,7 @@
         <w:pStyle w:val="ListNumber"/>
       </w:pPr>
       <w:r>
-        <w:t>**Man in the Mirror** (1988)</w:t>
+        <w:t>Conduct regular security audits to identify and address potential vulnerabilities and security risks.</w:t>
       </w:r>
     </w:p>
     <w:p>
@@ -85,28 +85,12 @@
         <w:pStyle w:val="ListNumber"/>
       </w:pPr>
       <w:r>
-        <w:t>**Dirty Diana** (1987)</w:t>
-      </w:r>
-    </w:p>
-    <w:p>
-      <w:pPr>
-        <w:pStyle w:val="ListNumber"/>
-      </w:pPr>
-      <w:r>
-        <w:t>**Rock with You** (1979)</w:t>
-      </w:r>
-    </w:p>
-    <w:p>
-      <w:pPr>
-        <w:pStyle w:val="ListNumber"/>
-      </w:pPr>
-      <w:r>
-        <w:t>**Human Nature** (1982)</w:t>
+        <w:t>Develop and implement incident response plans to quickly respond to and contain security incidents.</w:t>
       </w:r>
     </w:p>
     <w:p>
       <w:r>
-        <w:t>This list is based on critical acclaim and popularity, as determined by the Executor's methodology.</w:t>
+        <w:t>By implementing these mitigation strategies, organizations can reduce the risks associated with AI and ensure the secure and effective use of these technologies in healthcare.</w:t>
       </w:r>
     </w:p>
     <w:sectPr>

</xml_diff>

<commit_message>
added publish agent message
</commit_message>
<xml_diff>
--- a/outputs/reports/Multi-Agent System Analysis Report.docx
+++ b/outputs/reports/Multi-Agent System Analysis Report.docx
@@ -16,12 +16,7 @@
     </w:p>
     <w:p>
       <w:r>
-        <w:t>**FINAL ANSWER**</w:t>
-      </w:r>
-    </w:p>
-    <w:p>
-      <w:r>
-        <w:t>To address the identified security risks introduced by AI systems, organizations should implement the following practical mitigation strategies:</w:t>
+        <w:t>A comprehensive security framework for LLM agents has been proposed to ensure their safe and secure deployment. The framework includes 10 key components:</w:t>
       </w:r>
     </w:p>
     <w:p>
@@ -29,7 +24,7 @@
         <w:pStyle w:val="ListNumber"/>
       </w:pPr>
       <w:r>
-        <w:t>Implement robust testing and validation procedures to ensure AI models and digital twins are secure and functioning as intended.</w:t>
+        <w:t>Specialized AI Penetration Tests</w:t>
       </w:r>
     </w:p>
     <w:p>
@@ -37,7 +32,7 @@
         <w:pStyle w:val="ListNumber"/>
       </w:pPr>
       <w:r>
-        <w:t>Use secure AI development practices, including secure coding techniques and secure data storage and transmission protocols.</w:t>
+        <w:t>AI-Specific Security Measures</w:t>
       </w:r>
     </w:p>
     <w:p>
@@ -45,7 +40,7 @@
         <w:pStyle w:val="ListNumber"/>
       </w:pPr>
       <w:r>
-        <w:t>Establish AI-specific security protocols and policies to address the unique security challenges associated with AI.</w:t>
+        <w:t>Tool Integrations and MCP Configurations</w:t>
       </w:r>
     </w:p>
     <w:p>
@@ -53,7 +48,7 @@
         <w:pStyle w:val="ListNumber"/>
       </w:pPr>
       <w:r>
-        <w:t>Implement blockchain technology to enhance data privacy and protection.</w:t>
+        <w:t>Prompt Injection Prevention</w:t>
       </w:r>
     </w:p>
     <w:p>
@@ -61,7 +56,7 @@
         <w:pStyle w:val="ListNumber"/>
       </w:pPr>
       <w:r>
-        <w:t>Use secure IoMT communication protocols and decentralised systems to enhance device authentication and data integrity.</w:t>
+        <w:t>Memory Poisoning Prevention</w:t>
       </w:r>
     </w:p>
     <w:p>
@@ -69,7 +64,7 @@
         <w:pStyle w:val="ListNumber"/>
       </w:pPr>
       <w:r>
-        <w:t>Implement federated learning to reduce risks of adversarial and poisoning attacks.</w:t>
+        <w:t>Agent Communication Poisoning Prevention</w:t>
       </w:r>
     </w:p>
     <w:p>
@@ -77,7 +72,7 @@
         <w:pStyle w:val="ListNumber"/>
       </w:pPr>
       <w:r>
-        <w:t>Conduct regular security audits to identify and address potential vulnerabilities and security risks.</w:t>
+        <w:t>Training Data Security</w:t>
       </w:r>
     </w:p>
     <w:p>
@@ -85,12 +80,28 @@
         <w:pStyle w:val="ListNumber"/>
       </w:pPr>
       <w:r>
-        <w:t>Develop and implement incident response plans to quickly respond to and contain security incidents.</w:t>
+        <w:t>Model Updates and Patches</w:t>
+      </w:r>
+    </w:p>
+    <w:p>
+      <w:pPr>
+        <w:pStyle w:val="ListNumber"/>
+      </w:pPr>
+      <w:r>
+        <w:t>User Education and Awareness</w:t>
+      </w:r>
+    </w:p>
+    <w:p>
+      <w:pPr>
+        <w:pStyle w:val="ListNumber"/>
+      </w:pPr>
+      <w:r>
+        <w:t>Continuous Monitoring and Evaluation</w:t>
       </w:r>
     </w:p>
     <w:p>
       <w:r>
-        <w:t>By implementing these mitigation strategies, organizations can reduce the risks associated with AI and ensure the secure and effective use of these technologies in healthcare.</w:t>
+        <w:t>A roadmap for implementation has also been provided, outlining the steps to be taken to ensure the effective deployment of this security framework.</w:t>
       </w:r>
     </w:p>
     <w:sectPr>

</xml_diff>

<commit_message>
added more agents and tools
</commit_message>
<xml_diff>
--- a/outputs/reports/Multi-Agent System Analysis Report.docx
+++ b/outputs/reports/Multi-Agent System Analysis Report.docx
@@ -16,17 +16,7 @@
     </w:p>
     <w:p>
       <w:r>
-        <w:t>The final answer is:</w:t>
-      </w:r>
-    </w:p>
-    <w:p>
-      <w:r>
-        <w:t>**Personalized Cancer Treatment using Generative AIs**</w:t>
-      </w:r>
-    </w:p>
-    <w:p>
-      <w:r>
-        <w:t>Generative AI can be used to develop personalized cancer treatment plans by analyzing large datasets of patient medical histories, genetic profiles, and treatment outcomes to identify patterns and correlations. This approach has the potential to improve treatment outcomes, reduce treatment variability, and enhance patient experience.</w:t>
+        <w:t>The places near Kopay Teacher's College identified in this analysis are relevant to the user's request because they are located in the same geographical area and may be related to the topic of microbial contamination of public drinking water sources. The available evidence highlights the importance of ensuring the quality of drinking water, particularly in areas where groundwater is the primary source of water.</w:t>
       </w:r>
     </w:p>
     <w:sectPr>

</xml_diff>

<commit_message>
peer2peer topology corrected, shared pool corrected
</commit_message>
<xml_diff>
--- a/outputs/reports/Multi-Agent System Analysis Report.docx
+++ b/outputs/reports/Multi-Agent System Analysis Report.docx
@@ -16,7 +16,70 @@
     </w:p>
     <w:p>
       <w:r>
-        <w:t>The places near Kopay Teacher's College identified in this analysis are relevant to the user's request because they are located in the same geographical area and may be related to the topic of microbial contamination of public drinking water sources. The available evidence highlights the importance of ensuring the quality of drinking water, particularly in areas where groundwater is the primary source of water.</w:t>
+        <w:t>The final answer is:</w:t>
+      </w:r>
+    </w:p>
+    <w:p>
+      <w:r>
+        <w:t>The meeting details are as follows:</w:t>
+      </w:r>
+    </w:p>
+    <w:p>
+      <w:pPr>
+        <w:pStyle w:val="ListBullet"/>
+      </w:pPr>
+      <w:r>
+        <w:t>Date: Next Wednesday</w:t>
+      </w:r>
+    </w:p>
+    <w:p>
+      <w:pPr>
+        <w:pStyle w:val="ListBullet"/>
+      </w:pPr>
+      <w:r>
+        <w:t>Time: 10:00 AM</w:t>
+      </w:r>
+    </w:p>
+    <w:p>
+      <w:pPr>
+        <w:pStyle w:val="ListBullet"/>
+      </w:pPr>
+      <w:r>
+        <w:t>Duration: 60 minutes</w:t>
+      </w:r>
+    </w:p>
+    <w:p>
+      <w:pPr>
+        <w:pStyle w:val="ListBullet"/>
+      </w:pPr>
+      <w:r>
+        <w:t>Title: AI Agent Security Research Meeting</w:t>
+      </w:r>
+    </w:p>
+    <w:p>
+      <w:pPr>
+        <w:pStyle w:val="ListBullet"/>
+      </w:pPr>
+      <w:r>
+        <w:t>Description: To discuss the Analyst's findings and recommendations on effective meetings, public speaking, and organizational behavior management.</w:t>
+      </w:r>
+    </w:p>
+    <w:p>
+      <w:pPr>
+        <w:pStyle w:val="ListBullet"/>
+      </w:pPr>
+      <w:r>
+        <w:t>Participants: Coordinator, Researcher-1, Researcher-2, Analyst-1, and Analyst-2.</w:t>
+      </w:r>
+    </w:p>
+    <w:p>
+      <w:r>
+        <w:t>The selected topic for discussion is actually not related to AI-agent or cybersecurity research, but rather on effective meetings, public speaking, and organizational behavior management. This is a deviation from the original user task, which requested to find two recent AI-agent or cybersecurity research topics that should be discussed.</w:t>
+      </w:r>
+    </w:p>
+    <w:p>
+      <w:r>
+        <w:t>However, based on the Executor result, the meeting is scheduled to discuss the Analyst's findings and recommendations on effective meetings, public speaking, and organizational behavior management. Therefore, the final answer is based on the Executor result, and it does not meet the original user task requirements.</w:t>
       </w:r>
     </w:p>
     <w:sectPr>

</xml_diff>

<commit_message>
calender tool mail tool updated
</commit_message>
<xml_diff>
--- a/outputs/reports/Multi-Agent System Analysis Report.docx
+++ b/outputs/reports/Multi-Agent System Analysis Report.docx
@@ -21,65 +21,7 @@
     </w:p>
     <w:p>
       <w:r>
-        <w:t>The meeting details are as follows:</w:t>
-      </w:r>
-    </w:p>
-    <w:p>
-      <w:pPr>
-        <w:pStyle w:val="ListBullet"/>
-      </w:pPr>
-      <w:r>
-        <w:t>Date: Next Wednesday</w:t>
-      </w:r>
-    </w:p>
-    <w:p>
-      <w:pPr>
-        <w:pStyle w:val="ListBullet"/>
-      </w:pPr>
-      <w:r>
-        <w:t>Time: 10:00 AM</w:t>
-      </w:r>
-    </w:p>
-    <w:p>
-      <w:pPr>
-        <w:pStyle w:val="ListBullet"/>
-      </w:pPr>
-      <w:r>
-        <w:t>Duration: 60 minutes</w:t>
-      </w:r>
-    </w:p>
-    <w:p>
-      <w:pPr>
-        <w:pStyle w:val="ListBullet"/>
-      </w:pPr>
-      <w:r>
-        <w:t>Title: AI Agent Security Research Meeting</w:t>
-      </w:r>
-    </w:p>
-    <w:p>
-      <w:pPr>
-        <w:pStyle w:val="ListBullet"/>
-      </w:pPr>
-      <w:r>
-        <w:t>Description: To discuss the Analyst's findings and recommendations on effective meetings, public speaking, and organizational behavior management.</w:t>
-      </w:r>
-    </w:p>
-    <w:p>
-      <w:pPr>
-        <w:pStyle w:val="ListBullet"/>
-      </w:pPr>
-      <w:r>
-        <w:t>Participants: Coordinator, Researcher-1, Researcher-2, Analyst-1, and Analyst-2.</w:t>
-      </w:r>
-    </w:p>
-    <w:p>
-      <w:r>
-        <w:t>The selected topic for discussion is actually not related to AI-agent or cybersecurity research, but rather on effective meetings, public speaking, and organizational behavior management. This is a deviation from the original user task, which requested to find two recent AI-agent or cybersecurity research topics that should be discussed.</w:t>
-      </w:r>
-    </w:p>
-    <w:p>
-      <w:r>
-        <w:t>However, based on the Executor result, the meeting is scheduled to discuss the Analyst's findings and recommendations on effective meetings, public speaking, and organizational behavior management. Therefore, the final answer is based on the Executor result, and it does not meet the original user task requirements.</w:t>
+        <w:t>The AI Agent Security Research Meeting is scheduled for next Wednesday at 10:00 AM. The topic for discussion will be AI Agent Security, as determined by the Coordinator's analysis of recent research topics. The meeting will be attended by the Coordinator, Researcher-1, Researcher-2, Analyst-1, and Analyst-2.</w:t>
       </w:r>
     </w:p>
     <w:sectPr>

</xml_diff>